<commit_message>
Rework CV into chronological project timeline
Co-authored-by: ricv22 <ricv22@users.noreply.github.com>
</commit_message>
<xml_diff>
--- a/outreach/Richard_Andrys_CV_EN.docx
+++ b/outreach/Richard_Andrys_CV_EN.docx
@@ -325,7 +325,7 @@
           <w:color w:val="FF5A36"/>
           <w:sz w:val="17"/>
         </w:rPr>
-        <w:t>SELECTED WORK</w:t>
+        <w:t>PROJECT TIMELINE</w:t>
       </w:r>
     </w:p>
     <w:tbl>
@@ -335,8 +335,8 @@
         <w:tblLook w:firstColumn="1" w:firstRow="1" w:lastColumn="0" w:lastRow="0" w:noHBand="0" w:noVBand="1" w:val="04A0"/>
       </w:tblPr>
       <w:tblGrid>
-        <w:gridCol w:w="1814"/>
-        <w:gridCol w:w="8220"/>
+        <w:gridCol w:w="2047"/>
+        <w:gridCol w:w="8189"/>
       </w:tblGrid>
       <w:tr>
         <w:tc>
@@ -349,10 +349,10 @@
               <w:right w:val="nil"/>
             </w:tcBorders>
             <w:tcMar>
-              <w:top w:w="35" w:type="dxa"/>
+              <w:top w:w="25" w:type="dxa"/>
               <w:start w:w="0" w:type="dxa"/>
-              <w:bottom w:w="35" w:type="dxa"/>
-              <w:end w:w="90" w:type="dxa"/>
+              <w:bottom w:w="25" w:type="dxa"/>
+              <w:end w:w="80" w:type="dxa"/>
             </w:tcMar>
           </w:tcPr>
           <w:p>
@@ -361,9 +361,9 @@
                 <w:rFonts w:ascii="Arial" w:hAnsi="Arial"/>
                 <w:b/>
                 <w:color w:val="667085"/>
-                <w:sz w:val="14"/>
+                <w:sz w:val="15"/>
               </w:rPr>
-              <w:t>FILM VFX</w:t>
+              <w:t>2026</w:t>
             </w:r>
           </w:p>
         </w:tc>
@@ -377,15 +377,15 @@
               <w:right w:val="nil"/>
             </w:tcBorders>
             <w:tcMar>
-              <w:top w:w="35" w:type="dxa"/>
+              <w:top w:w="25" w:type="dxa"/>
               <w:start w:w="0" w:type="dxa"/>
-              <w:bottom w:w="35" w:type="dxa"/>
-              <w:end w:w="0" w:type="dxa"/>
+              <w:bottom w:w="25" w:type="dxa"/>
+              <w:end w:w="80" w:type="dxa"/>
             </w:tcMar>
           </w:tcPr>
           <w:p>
             <w:pPr>
-              <w:spacing w:after="20"/>
+              <w:spacing w:after="0"/>
             </w:pPr>
             <w:r>
               <w:rPr>
@@ -394,21 +394,20 @@
                 <w:color w:val="172033"/>
                 <w:sz w:val="17"/>
               </w:rPr>
-              <w:t>Princess Lost in Time</w:t>
+              <w:t>Princezna stokrát jinak</w:t>
             </w:r>
           </w:p>
           <w:p>
             <w:pPr>
-              <w:spacing w:line="250" w:lineRule="auto"/>
+              <w:spacing w:after="0"/>
             </w:pPr>
             <w:r>
               <w:rPr>
                 <w:rFonts w:ascii="Arial" w:hAnsi="Arial"/>
-                <w:b w:val="0"/>
-                <w:color w:val="172033"/>
+                <w:color w:val="667085"/>
                 <w:sz w:val="15"/>
               </w:rPr>
-              <w:t>Cinematic VFX sequence featuring a levitating dagger: tracking, digital object integration, compositing and grading.</w:t>
+              <w:t>Matchmove &amp; photogrammetry · QQ Studio</w:t>
             </w:r>
           </w:p>
         </w:tc>
@@ -421,8 +420,8 @@
         <w:tblLook w:firstColumn="1" w:firstRow="1" w:lastColumn="0" w:lastRow="0" w:noHBand="0" w:noVBand="1" w:val="04A0"/>
       </w:tblPr>
       <w:tblGrid>
-        <w:gridCol w:w="1814"/>
-        <w:gridCol w:w="8220"/>
+        <w:gridCol w:w="2047"/>
+        <w:gridCol w:w="8189"/>
       </w:tblGrid>
       <w:tr>
         <w:tc>
@@ -435,10 +434,10 @@
               <w:right w:val="nil"/>
             </w:tcBorders>
             <w:tcMar>
-              <w:top w:w="35" w:type="dxa"/>
+              <w:top w:w="25" w:type="dxa"/>
               <w:start w:w="0" w:type="dxa"/>
-              <w:bottom w:w="35" w:type="dxa"/>
-              <w:end w:w="90" w:type="dxa"/>
+              <w:bottom w:w="25" w:type="dxa"/>
+              <w:end w:w="80" w:type="dxa"/>
             </w:tcMar>
           </w:tcPr>
           <w:p>
@@ -447,9 +446,9 @@
                 <w:rFonts w:ascii="Arial" w:hAnsi="Arial"/>
                 <w:b/>
                 <w:color w:val="667085"/>
-                <w:sz w:val="14"/>
+                <w:sz w:val="15"/>
               </w:rPr>
-              <w:t>ANIMATION · CAMERA</w:t>
+              <w:t>2025</w:t>
             </w:r>
           </w:p>
         </w:tc>
@@ -463,15 +462,15 @@
               <w:right w:val="nil"/>
             </w:tcBorders>
             <w:tcMar>
-              <w:top w:w="35" w:type="dxa"/>
+              <w:top w:w="25" w:type="dxa"/>
               <w:start w:w="0" w:type="dxa"/>
-              <w:bottom w:w="35" w:type="dxa"/>
-              <w:end w:w="0" w:type="dxa"/>
+              <w:bottom w:w="25" w:type="dxa"/>
+              <w:end w:w="80" w:type="dxa"/>
             </w:tcMar>
           </w:tcPr>
           <w:p>
             <w:pPr>
-              <w:spacing w:after="20"/>
+              <w:spacing w:after="0"/>
             </w:pPr>
             <w:r>
               <w:rPr>
@@ -480,21 +479,20 @@
                 <w:color w:val="172033"/>
                 <w:sz w:val="17"/>
               </w:rPr>
-              <w:t>Hangar</w:t>
+              <w:t>JobChallenge</w:t>
             </w:r>
           </w:p>
           <w:p>
             <w:pPr>
-              <w:spacing w:line="250" w:lineRule="auto"/>
+              <w:spacing w:after="0"/>
             </w:pPr>
             <w:r>
               <w:rPr>
                 <w:rFonts w:ascii="Arial" w:hAnsi="Arial"/>
-                <w:b w:val="0"/>
-                <w:color w:val="172033"/>
+                <w:color w:val="667085"/>
                 <w:sz w:val="15"/>
               </w:rPr>
-              <w:t>FPV fly-through and camera choreography for a climbing gym, focused on speed, spatial clarity and controlled movement.</w:t>
+              <w:t>VFX</w:t>
             </w:r>
           </w:p>
         </w:tc>
@@ -507,8 +505,8 @@
         <w:tblLook w:firstColumn="1" w:firstRow="1" w:lastColumn="0" w:lastRow="0" w:noHBand="0" w:noVBand="1" w:val="04A0"/>
       </w:tblPr>
       <w:tblGrid>
-        <w:gridCol w:w="1814"/>
-        <w:gridCol w:w="8220"/>
+        <w:gridCol w:w="2047"/>
+        <w:gridCol w:w="8189"/>
       </w:tblGrid>
       <w:tr>
         <w:tc>
@@ -521,10 +519,10 @@
               <w:right w:val="nil"/>
             </w:tcBorders>
             <w:tcMar>
-              <w:top w:w="35" w:type="dxa"/>
+              <w:top w:w="25" w:type="dxa"/>
               <w:start w:w="0" w:type="dxa"/>
-              <w:bottom w:w="35" w:type="dxa"/>
-              <w:end w:w="90" w:type="dxa"/>
+              <w:bottom w:w="25" w:type="dxa"/>
+              <w:end w:w="80" w:type="dxa"/>
             </w:tcMar>
           </w:tcPr>
           <w:p>
@@ -533,9 +531,9 @@
                 <w:rFonts w:ascii="Arial" w:hAnsi="Arial"/>
                 <w:b/>
                 <w:color w:val="667085"/>
-                <w:sz w:val="14"/>
+                <w:sz w:val="15"/>
               </w:rPr>
-              <w:t>PRODUCT CGI</w:t>
+              <w:t>2025</w:t>
             </w:r>
           </w:p>
         </w:tc>
@@ -549,15 +547,15 @@
               <w:right w:val="nil"/>
             </w:tcBorders>
             <w:tcMar>
-              <w:top w:w="35" w:type="dxa"/>
+              <w:top w:w="25" w:type="dxa"/>
               <w:start w:w="0" w:type="dxa"/>
-              <w:bottom w:w="35" w:type="dxa"/>
-              <w:end w:w="0" w:type="dxa"/>
+              <w:bottom w:w="25" w:type="dxa"/>
+              <w:end w:w="80" w:type="dxa"/>
             </w:tcMar>
           </w:tcPr>
           <w:p>
             <w:pPr>
-              <w:spacing w:after="20"/>
+              <w:spacing w:after="0"/>
             </w:pPr>
             <w:r>
               <w:rPr>
@@ -566,21 +564,20 @@
                 <w:color w:val="172033"/>
                 <w:sz w:val="17"/>
               </w:rPr>
-              <w:t>Haya · eDisplay X-Stand</w:t>
+              <w:t>Cukrkandl</w:t>
             </w:r>
           </w:p>
           <w:p>
             <w:pPr>
-              <w:spacing w:line="250" w:lineRule="auto"/>
+              <w:spacing w:after="0"/>
             </w:pPr>
             <w:r>
               <w:rPr>
                 <w:rFonts w:ascii="Arial" w:hAnsi="Arial"/>
-                <w:b w:val="0"/>
-                <w:color w:val="172033"/>
+                <w:color w:val="667085"/>
                 <w:sz w:val="15"/>
               </w:rPr>
-              <w:t>Product visualization, look development and lighting for a premium drink; clean branded visuals for a modular exhibition stand.</w:t>
+              <w:t>Matchmove &amp; photogrammetry · QQ Studio</w:t>
             </w:r>
           </w:p>
         </w:tc>
@@ -593,8 +590,8 @@
         <w:tblLook w:firstColumn="1" w:firstRow="1" w:lastColumn="0" w:lastRow="0" w:noHBand="0" w:noVBand="1" w:val="04A0"/>
       </w:tblPr>
       <w:tblGrid>
-        <w:gridCol w:w="1814"/>
-        <w:gridCol w:w="8220"/>
+        <w:gridCol w:w="2047"/>
+        <w:gridCol w:w="8189"/>
       </w:tblGrid>
       <w:tr>
         <w:tc>
@@ -607,10 +604,10 @@
               <w:right w:val="nil"/>
             </w:tcBorders>
             <w:tcMar>
-              <w:top w:w="35" w:type="dxa"/>
+              <w:top w:w="25" w:type="dxa"/>
               <w:start w:w="0" w:type="dxa"/>
-              <w:bottom w:w="35" w:type="dxa"/>
-              <w:end w:w="90" w:type="dxa"/>
+              <w:bottom w:w="25" w:type="dxa"/>
+              <w:end w:w="80" w:type="dxa"/>
             </w:tcMar>
           </w:tcPr>
           <w:p>
@@ -619,9 +616,9 @@
                 <w:rFonts w:ascii="Arial" w:hAnsi="Arial"/>
                 <w:b/>
                 <w:color w:val="667085"/>
-                <w:sz w:val="14"/>
+                <w:sz w:val="15"/>
               </w:rPr>
-              <w:t>THEATRE · MOTION</w:t>
+              <w:t>2025</w:t>
             </w:r>
           </w:p>
         </w:tc>
@@ -635,15 +632,15 @@
               <w:right w:val="nil"/>
             </w:tcBorders>
             <w:tcMar>
-              <w:top w:w="35" w:type="dxa"/>
+              <w:top w:w="25" w:type="dxa"/>
               <w:start w:w="0" w:type="dxa"/>
-              <w:bottom w:w="35" w:type="dxa"/>
-              <w:end w:w="0" w:type="dxa"/>
+              <w:bottom w:w="25" w:type="dxa"/>
+              <w:end w:w="80" w:type="dxa"/>
             </w:tcMar>
           </w:tcPr>
           <w:p>
             <w:pPr>
-              <w:spacing w:after="20"/>
+              <w:spacing w:after="0"/>
             </w:pPr>
             <w:r>
               <w:rPr>
@@ -652,65 +649,83 @@
                 <w:color w:val="172033"/>
                 <w:sz w:val="17"/>
               </w:rPr>
-              <w:t>Rusalka</w:t>
+              <w:t>Zlatovláska</w:t>
             </w:r>
           </w:p>
           <w:p>
             <w:pPr>
-              <w:spacing w:line="250" w:lineRule="auto"/>
+              <w:spacing w:after="0"/>
             </w:pPr>
             <w:r>
               <w:rPr>
                 <w:rFonts w:ascii="Arial" w:hAnsi="Arial"/>
-                <w:b w:val="0"/>
-                <w:color w:val="172033"/>
+                <w:color w:val="667085"/>
                 <w:sz w:val="15"/>
               </w:rPr>
-              <w:t>Projection visuals, animation and lighting atmosphere created to support the stage design and dramaturgy.</w:t>
+              <w:t>Matchmove &amp; photogrammetry · QQ Studio</w:t>
             </w:r>
           </w:p>
         </w:tc>
       </w:tr>
     </w:tbl>
-    <w:p>
-      <w:pPr>
-        <w:spacing w:before="160" w:after="60"/>
-      </w:pPr>
-      <w:r>
-        <w:rPr>
-          <w:rFonts w:ascii="Arial" w:hAnsi="Arial"/>
-          <w:b/>
-          <w:color w:val="FF5A36"/>
-          <w:sz w:val="17"/>
-        </w:rPr>
-        <w:t>FILM CREDITS</w:t>
-      </w:r>
-    </w:p>
     <w:tbl>
       <w:tblPr>
         <w:tblW w:type="auto" w:w="0"/>
+        <w:tblLayout w:type="fixed"/>
         <w:tblLook w:firstColumn="1" w:firstRow="1" w:lastColumn="0" w:lastRow="0" w:noHBand="0" w:noVBand="1" w:val="04A0"/>
       </w:tblPr>
       <w:tblGrid>
-        <w:gridCol w:w="10148"/>
+        <w:gridCol w:w="2047"/>
+        <w:gridCol w:w="8189"/>
       </w:tblGrid>
       <w:tr>
         <w:tc>
           <w:tcPr>
-            <w:tcW w:type="dxa" w:w="10148"/>
+            <w:tcW w:type="dxa" w:w="5074"/>
+            <w:tcBorders>
+              <w:top w:val="nil"/>
+              <w:left w:val="nil"/>
+              <w:bottom w:val="nil"/>
+              <w:right w:val="nil"/>
+            </w:tcBorders>
             <w:tcMar>
-              <w:top w:w="70" w:type="dxa"/>
-              <w:start w:w="170" w:type="dxa"/>
-              <w:bottom w:w="70" w:type="dxa"/>
-              <w:end w:w="120" w:type="dxa"/>
+              <w:top w:w="25" w:type="dxa"/>
+              <w:start w:w="0" w:type="dxa"/>
+              <w:bottom w:w="25" w:type="dxa"/>
+              <w:end w:w="80" w:type="dxa"/>
             </w:tcMar>
+          </w:tcPr>
+          <w:p>
+            <w:r>
+              <w:rPr>
+                <w:rFonts w:ascii="Arial" w:hAnsi="Arial"/>
+                <w:b/>
+                <w:color w:val="667085"/>
+                <w:sz w:val="15"/>
+              </w:rPr>
+              <w:t>2025</w:t>
+            </w:r>
+          </w:p>
+        </w:tc>
+        <w:tc>
+          <w:tcPr>
+            <w:tcW w:type="dxa" w:w="5074"/>
             <w:tcBorders>
-              <w:left w:val="single" w:sz="14" w:color="FF5A36"/>
+              <w:top w:val="nil"/>
+              <w:left w:val="nil"/>
+              <w:bottom w:val="nil"/>
+              <w:right w:val="nil"/>
             </w:tcBorders>
+            <w:tcMar>
+              <w:top w:w="25" w:type="dxa"/>
+              <w:start w:w="0" w:type="dxa"/>
+              <w:bottom w:w="25" w:type="dxa"/>
+              <w:end w:w="80" w:type="dxa"/>
+            </w:tcMar>
           </w:tcPr>
           <w:p>
             <w:pPr>
-              <w:spacing w:after="40"/>
+              <w:spacing w:after="0"/>
             </w:pPr>
             <w:r>
               <w:rPr>
@@ -719,21 +734,360 @@
                 <w:color w:val="172033"/>
                 <w:sz w:val="17"/>
               </w:rPr>
-              <w:t>QQ Studio — Matchmove &amp; Photogrammetry</w:t>
+              <w:t>Zrození alchymistky</w:t>
             </w:r>
           </w:p>
           <w:p>
             <w:pPr>
-              <w:spacing w:line="259" w:lineRule="auto"/>
+              <w:spacing w:after="0"/>
             </w:pPr>
             <w:r>
               <w:rPr>
                 <w:rFonts w:ascii="Arial" w:hAnsi="Arial"/>
-                <w:b w:val="0"/>
-                <w:color w:val="172033"/>
+                <w:color w:val="667085"/>
                 <w:sz w:val="15"/>
               </w:rPr>
-              <w:t>Princezna zakletá v čase (2020) · Princezna zakletá v čase 2 (2022) · Zrození alchymistky (2025) · Zlatovláska (2025) · Cukrkandl (2025) · Princezna stokrát jinak (2026)</w:t>
+              <w:t>Matchmove &amp; photogrammetry · QQ Studio</w:t>
+            </w:r>
+          </w:p>
+        </w:tc>
+      </w:tr>
+    </w:tbl>
+    <w:tbl>
+      <w:tblPr>
+        <w:tblW w:type="auto" w:w="0"/>
+        <w:tblLayout w:type="fixed"/>
+        <w:tblLook w:firstColumn="1" w:firstRow="1" w:lastColumn="0" w:lastRow="0" w:noHBand="0" w:noVBand="1" w:val="04A0"/>
+      </w:tblPr>
+      <w:tblGrid>
+        <w:gridCol w:w="2047"/>
+        <w:gridCol w:w="8189"/>
+      </w:tblGrid>
+      <w:tr>
+        <w:tc>
+          <w:tcPr>
+            <w:tcW w:type="dxa" w:w="5074"/>
+            <w:tcBorders>
+              <w:top w:val="nil"/>
+              <w:left w:val="nil"/>
+              <w:bottom w:val="nil"/>
+              <w:right w:val="nil"/>
+            </w:tcBorders>
+            <w:tcMar>
+              <w:top w:w="25" w:type="dxa"/>
+              <w:start w:w="0" w:type="dxa"/>
+              <w:bottom w:w="25" w:type="dxa"/>
+              <w:end w:w="80" w:type="dxa"/>
+            </w:tcMar>
+          </w:tcPr>
+          <w:p>
+            <w:r>
+              <w:rPr>
+                <w:rFonts w:ascii="Arial" w:hAnsi="Arial"/>
+                <w:b/>
+                <w:color w:val="667085"/>
+                <w:sz w:val="15"/>
+              </w:rPr>
+              <w:t>2024–2025</w:t>
+            </w:r>
+          </w:p>
+        </w:tc>
+        <w:tc>
+          <w:tcPr>
+            <w:tcW w:type="dxa" w:w="5074"/>
+            <w:tcBorders>
+              <w:top w:val="nil"/>
+              <w:left w:val="nil"/>
+              <w:bottom w:val="nil"/>
+              <w:right w:val="nil"/>
+            </w:tcBorders>
+            <w:tcMar>
+              <w:top w:w="25" w:type="dxa"/>
+              <w:start w:w="0" w:type="dxa"/>
+              <w:bottom w:w="25" w:type="dxa"/>
+              <w:end w:w="80" w:type="dxa"/>
+            </w:tcMar>
+          </w:tcPr>
+          <w:p>
+            <w:pPr>
+              <w:spacing w:after="0"/>
+            </w:pPr>
+            <w:r>
+              <w:rPr>
+                <w:rFonts w:ascii="Arial" w:hAnsi="Arial"/>
+                <w:b/>
+                <w:color w:val="172033"/>
+                <w:sz w:val="17"/>
+              </w:rPr>
+              <w:t>Adam Ondra videos</w:t>
+            </w:r>
+          </w:p>
+          <w:p>
+            <w:pPr>
+              <w:spacing w:after="0"/>
+            </w:pPr>
+            <w:r>
+              <w:rPr>
+                <w:rFonts w:ascii="Arial" w:hAnsi="Arial"/>
+                <w:color w:val="667085"/>
+                <w:sz w:val="15"/>
+              </w:rPr>
+              <w:t>Tracking</w:t>
+            </w:r>
+          </w:p>
+        </w:tc>
+      </w:tr>
+    </w:tbl>
+    <w:tbl>
+      <w:tblPr>
+        <w:tblW w:type="auto" w:w="0"/>
+        <w:tblLayout w:type="fixed"/>
+        <w:tblLook w:firstColumn="1" w:firstRow="1" w:lastColumn="0" w:lastRow="0" w:noHBand="0" w:noVBand="1" w:val="04A0"/>
+      </w:tblPr>
+      <w:tblGrid>
+        <w:gridCol w:w="2047"/>
+        <w:gridCol w:w="8189"/>
+      </w:tblGrid>
+      <w:tr>
+        <w:tc>
+          <w:tcPr>
+            <w:tcW w:type="dxa" w:w="5074"/>
+            <w:tcBorders>
+              <w:top w:val="nil"/>
+              <w:left w:val="nil"/>
+              <w:bottom w:val="nil"/>
+              <w:right w:val="nil"/>
+            </w:tcBorders>
+            <w:tcMar>
+              <w:top w:w="25" w:type="dxa"/>
+              <w:start w:w="0" w:type="dxa"/>
+              <w:bottom w:w="25" w:type="dxa"/>
+              <w:end w:w="80" w:type="dxa"/>
+            </w:tcMar>
+          </w:tcPr>
+          <w:p>
+            <w:r>
+              <w:rPr>
+                <w:rFonts w:ascii="Arial" w:hAnsi="Arial"/>
+                <w:b/>
+                <w:color w:val="667085"/>
+                <w:sz w:val="15"/>
+              </w:rPr>
+              <w:t>2024</w:t>
+            </w:r>
+          </w:p>
+        </w:tc>
+        <w:tc>
+          <w:tcPr>
+            <w:tcW w:type="dxa" w:w="5074"/>
+            <w:tcBorders>
+              <w:top w:val="nil"/>
+              <w:left w:val="nil"/>
+              <w:bottom w:val="nil"/>
+              <w:right w:val="nil"/>
+            </w:tcBorders>
+            <w:tcMar>
+              <w:top w:w="25" w:type="dxa"/>
+              <w:start w:w="0" w:type="dxa"/>
+              <w:bottom w:w="25" w:type="dxa"/>
+              <w:end w:w="80" w:type="dxa"/>
+            </w:tcMar>
+          </w:tcPr>
+          <w:p>
+            <w:pPr>
+              <w:spacing w:after="0"/>
+            </w:pPr>
+            <w:r>
+              <w:rPr>
+                <w:rFonts w:ascii="Arial" w:hAnsi="Arial"/>
+                <w:b/>
+                <w:color w:val="172033"/>
+                <w:sz w:val="17"/>
+              </w:rPr>
+              <w:t>Tekma</w:t>
+            </w:r>
+          </w:p>
+          <w:p>
+            <w:pPr>
+              <w:spacing w:after="0"/>
+            </w:pPr>
+            <w:r>
+              <w:rPr>
+                <w:rFonts w:ascii="Arial" w:hAnsi="Arial"/>
+                <w:color w:val="667085"/>
+                <w:sz w:val="15"/>
+              </w:rPr>
+              <w:t>Animation</w:t>
+            </w:r>
+          </w:p>
+        </w:tc>
+      </w:tr>
+    </w:tbl>
+    <w:tbl>
+      <w:tblPr>
+        <w:tblW w:type="auto" w:w="0"/>
+        <w:tblLayout w:type="fixed"/>
+        <w:tblLook w:firstColumn="1" w:firstRow="1" w:lastColumn="0" w:lastRow="0" w:noHBand="0" w:noVBand="1" w:val="04A0"/>
+      </w:tblPr>
+      <w:tblGrid>
+        <w:gridCol w:w="2047"/>
+        <w:gridCol w:w="8189"/>
+      </w:tblGrid>
+      <w:tr>
+        <w:tc>
+          <w:tcPr>
+            <w:tcW w:type="dxa" w:w="5074"/>
+            <w:tcBorders>
+              <w:top w:val="nil"/>
+              <w:left w:val="nil"/>
+              <w:bottom w:val="nil"/>
+              <w:right w:val="nil"/>
+            </w:tcBorders>
+            <w:tcMar>
+              <w:top w:w="25" w:type="dxa"/>
+              <w:start w:w="0" w:type="dxa"/>
+              <w:bottom w:w="25" w:type="dxa"/>
+              <w:end w:w="80" w:type="dxa"/>
+            </w:tcMar>
+          </w:tcPr>
+          <w:p>
+            <w:r>
+              <w:rPr>
+                <w:rFonts w:ascii="Arial" w:hAnsi="Arial"/>
+                <w:b/>
+                <w:color w:val="667085"/>
+                <w:sz w:val="15"/>
+              </w:rPr>
+              <w:t>2022</w:t>
+            </w:r>
+          </w:p>
+        </w:tc>
+        <w:tc>
+          <w:tcPr>
+            <w:tcW w:type="dxa" w:w="5074"/>
+            <w:tcBorders>
+              <w:top w:val="nil"/>
+              <w:left w:val="nil"/>
+              <w:bottom w:val="nil"/>
+              <w:right w:val="nil"/>
+            </w:tcBorders>
+            <w:tcMar>
+              <w:top w:w="25" w:type="dxa"/>
+              <w:start w:w="0" w:type="dxa"/>
+              <w:bottom w:w="25" w:type="dxa"/>
+              <w:end w:w="80" w:type="dxa"/>
+            </w:tcMar>
+          </w:tcPr>
+          <w:p>
+            <w:pPr>
+              <w:spacing w:after="0"/>
+            </w:pPr>
+            <w:r>
+              <w:rPr>
+                <w:rFonts w:ascii="Arial" w:hAnsi="Arial"/>
+                <w:b/>
+                <w:color w:val="172033"/>
+                <w:sz w:val="17"/>
+              </w:rPr>
+              <w:t>Princezna zakletá v čase 2</w:t>
+            </w:r>
+          </w:p>
+          <w:p>
+            <w:pPr>
+              <w:spacing w:after="0"/>
+            </w:pPr>
+            <w:r>
+              <w:rPr>
+                <w:rFonts w:ascii="Arial" w:hAnsi="Arial"/>
+                <w:color w:val="667085"/>
+                <w:sz w:val="15"/>
+              </w:rPr>
+              <w:t>Matchmove &amp; photogrammetry · QQ Studio</w:t>
+            </w:r>
+          </w:p>
+        </w:tc>
+      </w:tr>
+    </w:tbl>
+    <w:tbl>
+      <w:tblPr>
+        <w:tblW w:type="auto" w:w="0"/>
+        <w:tblLayout w:type="fixed"/>
+        <w:tblLook w:firstColumn="1" w:firstRow="1" w:lastColumn="0" w:lastRow="0" w:noHBand="0" w:noVBand="1" w:val="04A0"/>
+      </w:tblPr>
+      <w:tblGrid>
+        <w:gridCol w:w="2047"/>
+        <w:gridCol w:w="8189"/>
+      </w:tblGrid>
+      <w:tr>
+        <w:tc>
+          <w:tcPr>
+            <w:tcW w:type="dxa" w:w="5074"/>
+            <w:tcBorders>
+              <w:top w:val="nil"/>
+              <w:left w:val="nil"/>
+              <w:bottom w:val="nil"/>
+              <w:right w:val="nil"/>
+            </w:tcBorders>
+            <w:tcMar>
+              <w:top w:w="25" w:type="dxa"/>
+              <w:start w:w="0" w:type="dxa"/>
+              <w:bottom w:w="25" w:type="dxa"/>
+              <w:end w:w="80" w:type="dxa"/>
+            </w:tcMar>
+          </w:tcPr>
+          <w:p>
+            <w:r>
+              <w:rPr>
+                <w:rFonts w:ascii="Arial" w:hAnsi="Arial"/>
+                <w:b/>
+                <w:color w:val="667085"/>
+                <w:sz w:val="15"/>
+              </w:rPr>
+              <w:t>2020</w:t>
+            </w:r>
+          </w:p>
+        </w:tc>
+        <w:tc>
+          <w:tcPr>
+            <w:tcW w:type="dxa" w:w="5074"/>
+            <w:tcBorders>
+              <w:top w:val="nil"/>
+              <w:left w:val="nil"/>
+              <w:bottom w:val="nil"/>
+              <w:right w:val="nil"/>
+            </w:tcBorders>
+            <w:tcMar>
+              <w:top w:w="25" w:type="dxa"/>
+              <w:start w:w="0" w:type="dxa"/>
+              <w:bottom w:w="25" w:type="dxa"/>
+              <w:end w:w="80" w:type="dxa"/>
+            </w:tcMar>
+          </w:tcPr>
+          <w:p>
+            <w:pPr>
+              <w:spacing w:after="0"/>
+            </w:pPr>
+            <w:r>
+              <w:rPr>
+                <w:rFonts w:ascii="Arial" w:hAnsi="Arial"/>
+                <w:b/>
+                <w:color w:val="172033"/>
+                <w:sz w:val="17"/>
+              </w:rPr>
+              <w:t>Princezna zakletá v čase</w:t>
+            </w:r>
+          </w:p>
+          <w:p>
+            <w:pPr>
+              <w:spacing w:after="0"/>
+            </w:pPr>
+            <w:r>
+              <w:rPr>
+                <w:rFonts w:ascii="Arial" w:hAnsi="Arial"/>
+                <w:color w:val="667085"/>
+                <w:sz w:val="15"/>
+              </w:rPr>
+              <w:t>Matchmove &amp; photogrammetry · QQ Studio</w:t>
             </w:r>
           </w:p>
         </w:tc>

</xml_diff>